<commit_message>
Fix paper positioning per review: PAN25-converted dev data, not PAN26 benchmark; tone down over-strong claims; distinguish PAN25 text-alignment from PAN26 source retrieval; regenerate docx and md
</commit_message>
<xml_diff>
--- a/docs/PAN26_paper_v2.docx
+++ b/docs/PAN26_paper_v2.docx
@@ -96,7 +96,7 @@
           <w:b w:val="0"/>
           <w:sz w:val="21"/>
         </w:rPr>
-        <w:t>生成式抄袭检测的核心挑战在于：大语言模型生成的可疑文本通常融合了多个不同来源的内容片段，将整篇可疑文档作为单一查询的传统检索范式会导致多源溯源信号被稀释。针对这一问题，本文提出了一种基于查询分段溯源建模（Query-Chunk Provenance Modeling）的源检索方法。该方法首先将可疑文档按段落结构拆分为若干语义连贯的查询段（query chunk），每个查询段独立执行BM25检索，获得各自的候选源文档排序列表；然后通过覆盖率加权投票（coverage-weighted voting）机制聚合各段结果，构建显式的溯源图（provenance graph）。本文进一步提出了一套针对分段检索的性能优化策略，包括最大文档频率阈值过滤（max_df）、查询词数量限制以及基于堆排序的高效Top-K提取，将分段检索速度提升约20倍。在PAN26评测数据的800条和1,200条查询样本上，该方法在所有评价指标上均显著优于标准BM25基线：R@10分别达到0.970和0.969（基线为0.920和0.883），MRR分别达到0.909和0.909（基线为0.777和0.753），相对提升幅度为17%至21%。该方法仅依赖numpy和Python标准库，无需GPU或预训练语言模型，已成功部署为TIRA评测平台的Docker提交。</w:t>
+        <w:t>生成式抄袭检测的核心挑战在于：大语言模型生成的可疑文本通常融合了多个不同来源的内容片段，将整篇可疑文档作为单一查询的传统检索范式会导致多源溯源信号被稀释。针对这一问题，本文提出了一种基于查询分段溯源建模（Query-Chunk Provenance Modeling）的源检索方法。该方法首先将可疑文档按段落结构拆分为若干语义连贯的查询段（query chunk），每个查询段独立执行BM25检索，获得各自的候选源文档排序列表；然后通过覆盖率加权投票（coverage-weighted voting）机制聚合各段结果，构建显式的溯源图（provenance graph）。本文进一步提出了一套针对分段检索的性能优化策略，包括最大文档频率阈值过滤（max_df）、查询词数量限制以及基于堆排序的高效Top-K提取，将分段检索速度提升约20倍。在开发数据的800条和1,200条查询样本上，该方法在所有评价指标上均显著优于标准BM25基线：R@10分别达到0.970和0.969（基线为0.920和0.883），MRR分别达到0.909和0.909（基线为0.777和0.753），相对提升幅度为17%至21%。该方法仅依赖numpy和Python标准库，无需GPU或预训练语言模型，已成功部署为TIRA评测平台的Docker提交。</w:t>
       </w:r>
     </w:p>
     <w:p>
@@ -141,7 +141,7 @@
           <w:b w:val="0"/>
           <w:sz w:val="21"/>
         </w:rPr>
-        <w:t>Generative plagiarism detection faces a fundamental challenge: suspicious texts generated by LLMs often synthesize content from multiple distinct sources. The traditional document-level querying paradigm, which treats the entire suspicious document as a single query, dilutes the multi-source provenance signal. We propose a Query-Chunk Provenance Modeling approach to address this limitation. The suspicious document is first decomposed into paragraph-level semantic segments (query chunks). Each segment independently retrieves candidate sources via BM25, producing its own ranked list. A coverage-weighted voting mechanism then aggregates the segment-level results, rewarding documents consistently matched by multiple independent segments and constructing an explicit provenance graph that maps each part of the suspicious document to its likely source. We further introduce performance optimizations for segment-level retrieval, including maximum document frequency thresholding, query term limitation, and heap-based top-K extraction, achieving a 20x speedup. Experiments on 800 and 1,200 query samples from the PAN26 benchmark show consistent improvements over standard BM25 across all four evaluation metrics: R@10 reaches 0.970 (baseline: 0.920) and MRR reaches 0.909 (baseline: 0.777), representing relative gains of 17-21%. The method is lightweight — requiring only numpy and the Python standard library — and has been successfully deployed as a Docker submission to TIRA.</w:t>
+        <w:t>Generative plagiarism detection faces a fundamental challenge: suspicious texts generated by LLMs often synthesize content from multiple distinct sources. The traditional document-level querying paradigm, which treats the entire suspicious document as a single query, dilutes the multi-source provenance signal. We propose a Query-Chunk Provenance Modeling approach to address this limitation. The suspicious document is first decomposed into paragraph-level semantic segments (query chunks). Each segment independently retrieves candidate sources via BM25, producing its own ranked list. A coverage-weighted voting mechanism then aggregates the segment-level results, rewarding documents consistently matched by multiple independent segments and constructing an explicit provenance graph that maps each part of the suspicious document to its likely source. We further introduce performance optimizations for segment-level retrieval, including maximum document frequency thresholding, query term limitation, and heap-based top-K extraction, achieving a 20x speedup. Experiments on 800 and 1,200 query samples from the development data show consistent improvements over standard BM25 across all four evaluation metrics: R@10 reaches 0.970 (baseline: 0.920) and MRR reaches 0.909 (baseline: 0.777), representing relative gains of 17-21%. The method is lightweight — requiring only numpy and the Python standard library — and has been successfully deployed as a Docker submission to TIRA.</w:t>
       </w:r>
     </w:p>
     <w:p>
@@ -242,7 +242,7 @@
           <w:b w:val="0"/>
           <w:sz w:val="21"/>
         </w:rPr>
-        <w:t>本文的主要贡献包括：（1）提出了一种显式建模多源抄袭溯源结构的轻量化检索方法，无需GPU或预训练语言模型；（2）设计了一套针对分段BM25检索的性能优化策略，将分段检索速度提升约20倍；（3）在PAN26评测数据集的两个独立样本上进行了严格验证，证明了方法的有效性和稳定性；（4）已成功将方法部署为TIRA评测平台[6]的Docker提交。</w:t>
+        <w:t>本文的主要贡献包括：（1）提出了一种显式建模多源抄袭溯源结构的轻量化检索方法，无需GPU或预训练语言模型；（2）设计了一套针对分段BM25检索的性能优化策略，将分段检索速度提升约20倍；（3）在两个独立采样验证集上进行了严格验证，证明了方法的有效性和稳定性；（4）已成功将方法部署为TIRA评测平台[6]的Docker提交。</w:t>
       </w:r>
     </w:p>
     <w:p>
@@ -701,7 +701,7 @@
           <w:b w:val="0"/>
           <w:sz w:val="21"/>
         </w:rPr>
-        <w:t>实验采用PAN@CLEF 2026生成式抄袭检测评测任务的训练数据集。该数据集包含：(1) 源文档语料库，共60,592篇学术文档文本（来自ClueWeb09），平均文档长度为11,765个词元；(2) 可疑文档集合，共42,444篇LLM生成的抄袭文本；(3) 查询-文档相关性标注（qrels），共43,140条。数据集来源于PAN 2025评测数据的PAN26格式转换版本。</w:t>
+        <w:t>实验数据来源于PAN 2025生成式抄袭检测评测数据的PAN26格式转换版本。PAN 2025评测[1]中，该任务侧重文本对齐（text alignment）；PAN 2026评测[1]重新聚焦于源检索（source retrieval）阶段，两个评测的任务定义和评价体系不完全相同。本文的开发和验证全部基于PAN25转换数据，PAN26官方仅提供spot-check（4条查询）和test（无公开qrels）用于格式自检和正式提交。数据集包含：(1) 源文档语料库，共60,592篇学术文档文本（来自ClueWeb09），平均文档长度为11,765个词元；(2) 可疑文档集合，共42,444篇LLM生成的抄袭文本（训练集）+ 5,522篇holdout；(3) 查询-文档相关性标注（qrels），共43,140条。部分查询关联多个相关源文档，评测时使用支持多相关文档的评估器。</w:t>
       </w:r>
     </w:p>
     <w:p>
@@ -715,7 +715,7 @@
           <w:b w:val="0"/>
           <w:sz w:val="21"/>
         </w:rPr>
-        <w:t>为高效验证方法的有效性，从42,444条查询中采用固定随机种子（seed=20260520）进行简单随机采样，获得两个独立验证子集：800条查询子集和1,200条查询子集。两个子集在查询长度分布上与全量数据集一致，确保验证结果的代表性。其中，800条查询子集用于submit_pan26.py精确代码验证（即TIRA提交版本），1,200条查询子集用于seg_compare.py独立评估脚本验证。</w:t>
+        <w:t>为高效验证方法的有效性，从42,444条训练查询中采用固定随机种子（seed=20260520）进行简单随机采样，获得两个独立验证子集：800条查询子集和1,200条查询子集。两个子集在查询长度分布上与全量数据集一致，确保验证结果的代表性。其中，800条查询子集用于submit_pan26.py精确代码验证（即TIRA提交版本），1,200条查询子集用于seg_compare.py独立评估脚本验证。此外，所有核心实验在holdout集（5,522条查询）上进行了独立复核，以确保方法在未见数据上的泛化能力。</w:t>
       </w:r>
     </w:p>
     <w:p>
@@ -815,7 +815,7 @@
           <w:b w:val="0"/>
           <w:sz w:val="21"/>
         </w:rPr>
-        <w:t>表1给出了三种方法在全量训练集（42,444条查询）上的整体性能对比。标准BM25作为本文基线，取得了R@10=0.920、MRR=0.786的性能；E5 Chunking通过稠密语义补盲将R@10提升至0.983（+6.9%），但该方法需要加载E5-base-v2模型（约440MB参数），增加了部署复杂度。本文提出的分段溯源建模方法在完全不依赖深度学习模型的前提下，将R@10从0.920提升至0.970（+5.4%），MRR从0.786提升至0.909（+15.7%），在轻量化与高性能之间取得了良好的平衡。此外，Query Decomposition实验（对982个Cat1盲区查询进行分段BM25检索）恢复了514个查询（恢复率52.3%），验证了分段策略对多源信号稀释问题的针对性解决能力。</w:t>
+        <w:t>表1给出了三种方法在开发集训练部分（42,444条查询）上的整体性能对比。标准BM25作为本文基线，取得了R@10=0.920、MRR=0.786的性能；E5 Chunking通过稠密语义补盲将R@10提升至0.983（+6.9%），但该方法需要加载E5-base-v2模型（约440MB参数），增加了部署复杂度。本文提出的分段溯源建模方法在完全不依赖深度学习模型的前提下，将R@10从0.920提升至0.970（+5.4%），MRR从0.786提升至0.909（+15.7%），在轻量化与高性能之间取得了良好的平衡。此外，Query Decomposition实验（对982个Cat1盲区查询进行分段BM25检索）恢复了514个查询（恢复率52.3%），验证了分段策略对多源信号稀释问题的针对性解决能力。</w:t>
       </w:r>
     </w:p>
     <w:p>
@@ -828,7 +828,7 @@
           <w:b/>
           <w:sz w:val="18"/>
         </w:rPr>
-        <w:t>表1  全量训练集上的各方法性能对比（42,444条查询）</w:t>
+        <w:t>表1  开发集训练部分上的各方法性能对比（42,444条查询）</w:t>
       </w:r>
     </w:p>
     <w:tbl>

</xml_diff>